<commit_message>
Add Y13 9618 Classes 2 lesson (inheritance, polymorphism, containment); fix docx border order in Classes
Co-Authored-By: Claude Opus 5.5 <noreply@anthropic.com>
Claude-Session: https://claude.ai/code/session_01J6TacjVoJLZenSaz45LVXj
</commit_message>
<xml_diff>
--- a/9618 P4/Classes/Classes_and_Paradigms_Answer_Key.docx
+++ b/9618 P4/Classes/Classes_and_Paradigms_Answer_Key.docx
@@ -1977,8 +1977,8 @@
         <w:keepLines/>
         <w:pBdr>
           <w:top w:val="single" w:color="D8D8E4" w:sz="4" w:space="4"/>
+          <w:left w:val="single" w:color="D8D8E4" w:sz="4" w:space="4"/>
           <w:bottom w:val="single" w:color="D8D8E4" w:sz="4" w:space="4"/>
-          <w:left w:val="single" w:color="D8D8E4" w:sz="4" w:space="4"/>
           <w:right w:val="single" w:color="D8D8E4" w:sz="4" w:space="4"/>
         </w:pBdr>
         <w:shd w:fill="F5F5F8" w:color="auto" w:val="clear"/>
@@ -6093,8 +6093,8 @@
         <w:keepLines/>
         <w:pBdr>
           <w:top w:val="single" w:color="D8D8E4" w:sz="4" w:space="4"/>
+          <w:left w:val="single" w:color="D8D8E4" w:sz="4" w:space="4"/>
           <w:bottom w:val="single" w:color="D8D8E4" w:sz="4" w:space="4"/>
-          <w:left w:val="single" w:color="D8D8E4" w:sz="4" w:space="4"/>
           <w:right w:val="single" w:color="D8D8E4" w:sz="4" w:space="4"/>
         </w:pBdr>
         <w:shd w:fill="F5F5F8" w:color="auto" w:val="clear"/>

</xml_diff>